<commit_message>
feat: nop bai tuan05
</commit_message>
<xml_diff>
--- a/Lab04/Lab04.docx
+++ b/Lab04/Lab04.docx
@@ -16,47 +16,53 @@
         </w:rPr>
         <w:t>Lê Ngọc Hảo - 225683241</w:t>
       </w:r>
+      <w:r>
+        <w:rPr>
+          <w:rFonts w:hint="default"/>
+          <w:lang w:val="en-US"/>
+        </w:rPr>
+        <w:tab/>
+      </w:r>
+    </w:p>
+    <w:p>
+      <w:pPr>
+        <w:rPr>
+          <w:rFonts w:hint="default"/>
+          <w:lang w:val="en-US"/>
+        </w:rPr>
+      </w:pPr>
+    </w:p>
+    <w:p>
+      <w:pPr>
+        <w:rPr>
+          <w:rFonts w:hint="default"/>
+          <w:lang w:val="en-US"/>
+        </w:rPr>
+      </w:pPr>
+      <w:r>
+        <w:rPr>
+          <w:rFonts w:hint="default"/>
+          <w:lang w:val="en-US"/>
+        </w:rPr>
+        <w:t>Phần 1</w:t>
+      </w:r>
+    </w:p>
+    <w:p>
+      <w:r>
+        <w:rPr>
+          <w:rFonts w:hint="default"/>
+          <w:lang w:val="en-US"/>
+        </w:rPr>
+        <w:t>docker --version</w:t>
+      </w:r>
+      <w:r>
+        <w:rPr>
+          <w:rFonts w:hint="default"/>
+          <w:lang w:val="en-US"/>
+        </w:rPr>
+        <w:br w:type="textWrapping"/>
+      </w:r>
       <w:bookmarkStart w:id="0" w:name="_GoBack"/>
-      <w:bookmarkEnd w:id="0"/>
-    </w:p>
-    <w:p>
-      <w:pPr>
-        <w:rPr>
-          <w:rFonts w:hint="default"/>
-          <w:lang w:val="en-US"/>
-        </w:rPr>
-      </w:pPr>
-    </w:p>
-    <w:p>
-      <w:pPr>
-        <w:rPr>
-          <w:rFonts w:hint="default"/>
-          <w:lang w:val="en-US"/>
-        </w:rPr>
-      </w:pPr>
-      <w:r>
-        <w:rPr>
-          <w:rFonts w:hint="default"/>
-          <w:lang w:val="en-US"/>
-        </w:rPr>
-        <w:t>Phần 1</w:t>
-      </w:r>
-    </w:p>
-    <w:p>
-      <w:r>
-        <w:rPr>
-          <w:rFonts w:hint="default"/>
-          <w:lang w:val="en-US"/>
-        </w:rPr>
-        <w:t>docker --version</w:t>
-      </w:r>
-      <w:r>
-        <w:rPr>
-          <w:rFonts w:hint="default"/>
-          <w:lang w:val="en-US"/>
-        </w:rPr>
-        <w:br w:type="textWrapping"/>
-      </w:r>
       <w:r>
         <w:drawing>
           <wp:inline distT="0" distB="0" distL="114300" distR="114300">
@@ -100,6 +106,7 @@
           </wp:inline>
         </w:drawing>
       </w:r>
+      <w:bookmarkEnd w:id="0"/>
     </w:p>
     <w:p/>
     <w:p>

</xml_diff>